<commit_message>
Updated Assignemnt on courses DM and QR
Updated Assignemnt on courses DM and QR
</commit_message>
<xml_diff>
--- a/Courses/DM/Discrete Maths Course Outlines.docx
+++ b/Courses/DM/Discrete Maths Course Outlines.docx
@@ -12,7 +12,6 @@
           <w:sz w:val="24"/>
         </w:rPr>
       </w:pPr>
-      <w:bookmarkStart w:id="0" w:name="_GoBack"/>
       <w:r>
         <w:rPr>
           <w:spacing w:val="-1"/>
@@ -87,7 +86,6 @@
         <w:t>NAWABSHAH</w:t>
       </w:r>
     </w:p>
-    <w:bookmarkEnd w:id="0"/>
     <w:p>
       <w:pPr>
         <w:spacing w:line="789" w:lineRule="exact"/>
@@ -2762,6 +2760,7 @@
         <w:ind w:right="215"/>
         <w:jc w:val="both"/>
       </w:pPr>
+      <w:bookmarkStart w:id="0" w:name="_GoBack"/>
       <w:r>
         <w:rPr>
           <w:spacing w:val="-1"/>
@@ -2823,7 +2822,14 @@
         <w:rPr>
           <w:spacing w:val="-1"/>
         </w:rPr>
-        <w:t>logic,</w:t>
+        <w:t>logic</w:t>
+      </w:r>
+      <w:bookmarkEnd w:id="0"/>
+      <w:r>
+        <w:rPr>
+          <w:spacing w:val="-1"/>
+        </w:rPr>
+        <w:t>,</w:t>
       </w:r>
       <w:r>
         <w:rPr>
@@ -2999,207 +3005,254 @@
       <w:r>
         <w:rPr>
           <w:spacing w:val="-1"/>
+          <w:highlight w:val="yellow"/>
         </w:rPr>
         <w:t>set</w:t>
       </w:r>
       <w:r>
         <w:rPr>
           <w:spacing w:val="-7"/>
-        </w:rPr>
-        <w:t xml:space="preserve"> </w:t>
-      </w:r>
-      <w:r>
-        <w:rPr>
-          <w:spacing w:val="-1"/>
+          <w:highlight w:val="yellow"/>
+        </w:rPr>
+        <w:t xml:space="preserve"> </w:t>
+      </w:r>
+      <w:r>
+        <w:rPr>
+          <w:spacing w:val="-1"/>
+          <w:highlight w:val="yellow"/>
         </w:rPr>
         <w:t>theory,</w:t>
       </w:r>
       <w:r>
         <w:rPr>
           <w:spacing w:val="-10"/>
-        </w:rPr>
-        <w:t xml:space="preserve"> </w:t>
-      </w:r>
-      <w:r>
-        <w:rPr>
-          <w:spacing w:val="-1"/>
+          <w:highlight w:val="yellow"/>
+        </w:rPr>
+        <w:t xml:space="preserve"> </w:t>
+      </w:r>
+      <w:r>
+        <w:rPr>
+          <w:spacing w:val="-1"/>
+          <w:highlight w:val="yellow"/>
         </w:rPr>
         <w:t>relations,</w:t>
       </w:r>
       <w:r>
         <w:rPr>
           <w:spacing w:val="-9"/>
-        </w:rPr>
-        <w:t xml:space="preserve"> </w:t>
-      </w:r>
-      <w:r>
-        <w:rPr>
-          <w:spacing w:val="-1"/>
+          <w:highlight w:val="yellow"/>
+        </w:rPr>
+        <w:t xml:space="preserve"> </w:t>
+      </w:r>
+      <w:r>
+        <w:rPr>
+          <w:spacing w:val="-1"/>
+          <w:highlight w:val="yellow"/>
         </w:rPr>
         <w:t>equivalence</w:t>
       </w:r>
       <w:r>
         <w:rPr>
           <w:spacing w:val="-9"/>
-        </w:rPr>
-        <w:t xml:space="preserve"> </w:t>
-      </w:r>
-      <w:r>
-        <w:rPr>
-          <w:spacing w:val="-1"/>
+          <w:highlight w:val="yellow"/>
+        </w:rPr>
+        <w:t xml:space="preserve"> </w:t>
+      </w:r>
+      <w:r>
+        <w:rPr>
+          <w:spacing w:val="-1"/>
+          <w:highlight w:val="yellow"/>
         </w:rPr>
         <w:t>relations</w:t>
       </w:r>
       <w:r>
         <w:rPr>
           <w:spacing w:val="-9"/>
-        </w:rPr>
-        <w:t xml:space="preserve"> </w:t>
-      </w:r>
-      <w:r>
+          <w:highlight w:val="yellow"/>
+        </w:rPr>
+        <w:t xml:space="preserve"> </w:t>
+      </w:r>
+      <w:r>
+        <w:rPr>
+          <w:highlight w:val="yellow"/>
+        </w:rPr>
         <w:t>and</w:t>
       </w:r>
       <w:r>
         <w:rPr>
           <w:spacing w:val="91"/>
-        </w:rPr>
-        <w:t xml:space="preserve"> </w:t>
-      </w:r>
-      <w:r>
-        <w:rPr>
-          <w:spacing w:val="-1"/>
+          <w:highlight w:val="yellow"/>
+        </w:rPr>
+        <w:t xml:space="preserve"> </w:t>
+      </w:r>
+      <w:r>
+        <w:rPr>
+          <w:spacing w:val="-1"/>
+          <w:highlight w:val="yellow"/>
         </w:rPr>
         <w:t>partitions,</w:t>
       </w:r>
       <w:r>
-        <w:t xml:space="preserve"> </w:t>
-      </w:r>
-      <w:r>
-        <w:rPr>
-          <w:spacing w:val="-1"/>
+        <w:rPr>
+          <w:highlight w:val="yellow"/>
+        </w:rPr>
+        <w:t xml:space="preserve"> </w:t>
+      </w:r>
+      <w:r>
+        <w:rPr>
+          <w:spacing w:val="-1"/>
+          <w:highlight w:val="yellow"/>
         </w:rPr>
         <w:t>partial</w:t>
       </w:r>
       <w:r>
         <w:rPr>
           <w:spacing w:val="1"/>
-        </w:rPr>
-        <w:t xml:space="preserve"> </w:t>
-      </w:r>
-      <w:r>
-        <w:rPr>
-          <w:spacing w:val="-1"/>
+          <w:highlight w:val="yellow"/>
+        </w:rPr>
+        <w:t xml:space="preserve"> </w:t>
+      </w:r>
+      <w:r>
+        <w:rPr>
+          <w:spacing w:val="-1"/>
+          <w:highlight w:val="yellow"/>
         </w:rPr>
         <w:t>orderings,</w:t>
       </w:r>
       <w:r>
-        <w:t xml:space="preserve"> </w:t>
-      </w:r>
-      <w:r>
-        <w:rPr>
-          <w:spacing w:val="-1"/>
+        <w:rPr>
+          <w:highlight w:val="yellow"/>
+        </w:rPr>
+        <w:t xml:space="preserve"> </w:t>
+      </w:r>
+      <w:r>
+        <w:rPr>
+          <w:spacing w:val="-1"/>
+          <w:highlight w:val="yellow"/>
         </w:rPr>
         <w:t>recurrence</w:t>
       </w:r>
       <w:r>
-        <w:t xml:space="preserve"> </w:t>
-      </w:r>
-      <w:r>
-        <w:rPr>
-          <w:spacing w:val="-1"/>
+        <w:rPr>
+          <w:highlight w:val="yellow"/>
+        </w:rPr>
+        <w:t xml:space="preserve"> </w:t>
+      </w:r>
+      <w:r>
+        <w:rPr>
+          <w:spacing w:val="-1"/>
+          <w:highlight w:val="yellow"/>
         </w:rPr>
         <w:t>relations,</w:t>
       </w:r>
       <w:r>
         <w:rPr>
           <w:spacing w:val="53"/>
-        </w:rPr>
-        <w:t xml:space="preserve"> </w:t>
-      </w:r>
-      <w:r>
-        <w:rPr>
-          <w:spacing w:val="-1"/>
+          <w:highlight w:val="yellow"/>
+        </w:rPr>
+        <w:t xml:space="preserve"> </w:t>
+      </w:r>
+      <w:r>
+        <w:rPr>
+          <w:spacing w:val="-1"/>
+          <w:highlight w:val="yellow"/>
         </w:rPr>
         <w:t>functions,</w:t>
       </w:r>
       <w:r>
         <w:rPr>
           <w:spacing w:val="53"/>
-        </w:rPr>
-        <w:t xml:space="preserve"> </w:t>
-      </w:r>
-      <w:r>
-        <w:rPr>
-          <w:spacing w:val="-1"/>
+          <w:highlight w:val="yellow"/>
+        </w:rPr>
+        <w:t xml:space="preserve"> </w:t>
+      </w:r>
+      <w:r>
+        <w:rPr>
+          <w:spacing w:val="-1"/>
+          <w:highlight w:val="yellow"/>
         </w:rPr>
         <w:t>mappings,</w:t>
       </w:r>
       <w:r>
         <w:rPr>
           <w:spacing w:val="53"/>
-        </w:rPr>
-        <w:t xml:space="preserve"> </w:t>
-      </w:r>
-      <w:r>
-        <w:rPr>
-          <w:spacing w:val="-1"/>
+          <w:highlight w:val="yellow"/>
+        </w:rPr>
+        <w:t xml:space="preserve"> </w:t>
+      </w:r>
+      <w:r>
+        <w:rPr>
+          <w:spacing w:val="-1"/>
+          <w:highlight w:val="yellow"/>
         </w:rPr>
         <w:t>function</w:t>
       </w:r>
       <w:r>
-        <w:t xml:space="preserve"> </w:t>
-      </w:r>
-      <w:r>
-        <w:rPr>
-          <w:spacing w:val="-1"/>
+        <w:rPr>
+          <w:highlight w:val="yellow"/>
+        </w:rPr>
+        <w:t xml:space="preserve"> </w:t>
+      </w:r>
+      <w:r>
+        <w:rPr>
+          <w:spacing w:val="-1"/>
+          <w:highlight w:val="yellow"/>
         </w:rPr>
         <w:t>composition,</w:t>
       </w:r>
       <w:r>
         <w:rPr>
           <w:spacing w:val="52"/>
-        </w:rPr>
-        <w:t xml:space="preserve"> </w:t>
-      </w:r>
-      <w:r>
-        <w:rPr>
-          <w:spacing w:val="-1"/>
+          <w:highlight w:val="yellow"/>
+        </w:rPr>
+        <w:t xml:space="preserve"> </w:t>
+      </w:r>
+      <w:r>
+        <w:rPr>
+          <w:spacing w:val="-1"/>
+          <w:highlight w:val="yellow"/>
         </w:rPr>
         <w:t>inverse</w:t>
       </w:r>
       <w:r>
         <w:rPr>
           <w:spacing w:val="71"/>
-        </w:rPr>
-        <w:t xml:space="preserve"> </w:t>
-      </w:r>
-      <w:r>
-        <w:rPr>
-          <w:spacing w:val="-1"/>
+          <w:highlight w:val="yellow"/>
+        </w:rPr>
+        <w:t xml:space="preserve"> </w:t>
+      </w:r>
+      <w:r>
+        <w:rPr>
+          <w:spacing w:val="-1"/>
+          <w:highlight w:val="yellow"/>
         </w:rPr>
         <w:t>functions,</w:t>
       </w:r>
       <w:r>
         <w:rPr>
           <w:spacing w:val="53"/>
-        </w:rPr>
-        <w:t xml:space="preserve"> </w:t>
-      </w:r>
-      <w:r>
-        <w:rPr>
-          <w:spacing w:val="-1"/>
+          <w:highlight w:val="yellow"/>
+        </w:rPr>
+        <w:t xml:space="preserve"> </w:t>
+      </w:r>
+      <w:r>
+        <w:rPr>
+          <w:spacing w:val="-1"/>
+          <w:highlight w:val="yellow"/>
         </w:rPr>
         <w:t>recursive</w:t>
       </w:r>
       <w:r>
         <w:rPr>
           <w:spacing w:val="53"/>
-        </w:rPr>
-        <w:t xml:space="preserve"> </w:t>
-      </w:r>
-      <w:r>
-        <w:rPr>
-          <w:spacing w:val="-1"/>
+          <w:highlight w:val="yellow"/>
+        </w:rPr>
+        <w:t xml:space="preserve"> </w:t>
+      </w:r>
+      <w:r>
+        <w:rPr>
+          <w:spacing w:val="-1"/>
+          <w:highlight w:val="yellow"/>
         </w:rPr>
         <w:t>functions,</w:t>
       </w:r>
@@ -3530,13 +3583,7 @@
         <w:rPr>
           <w:spacing w:val="-1"/>
         </w:rPr>
-        <w:t>Alg</w:t>
-      </w:r>
-      <w:r>
-        <w:rPr>
-          <w:spacing w:val="-1"/>
-        </w:rPr>
-        <w:t>orithms,</w:t>
+        <w:t>Algorithms,</w:t>
       </w:r>
       <w:r>
         <w:rPr>

</xml_diff>